<commit_message>
Condense MSc CV for readability
Co-authored-by: arena-agent <297053741+arena-agent@users.noreply.github.com>
</commit_message>
<xml_diff>
--- a/Shayan_Amouzadeh_MSc_CV.docx
+++ b/Shayan_Amouzadeh_MSc_CV.docx
@@ -4,21 +4,21 @@
   <w:body>
     <w:p>
       <w:pPr>
-        <w:spacing w:before="0" w:after="20" w:line="240" w:lineRule="auto"/>
+        <w:spacing w:after="20"/>
       </w:pPr>
       <w:r>
         <w:rPr>
           <w:rFonts w:ascii="Arial" w:hAnsi="Arial" w:cs="Arial" w:eastAsia="Arial"/>
           <w:b/>
           <w:color w:val="18354A"/>
-          <w:sz w:val="46"/>
+          <w:sz w:val="50"/>
         </w:rPr>
         <w:t>Shayan Amouzadeh</w:t>
       </w:r>
     </w:p>
     <w:p>
       <w:pPr>
-        <w:spacing w:after="20" w:line="240" w:lineRule="auto"/>
+        <w:spacing w:after="20"/>
       </w:pPr>
       <w:r>
         <w:rPr>
@@ -57,7 +57,7 @@
           <w:rPr>
             <w:rFonts w:ascii="Arial" w:hAnsi="Arial" w:cs="Arial" w:eastAsia="Arial"/>
             <w:color w:val="1557A0"/>
-            <w:sz w:val="17"/>
+            <w:sz w:val="18"/>
           </w:rPr>
           <w:t xml:space="preserve">shayanamz.7687@gmail.com</w:t>
         </w:r>
@@ -65,9 +65,9 @@
     </w:p>
     <w:p>
       <w:pPr>
-        <w:spacing w:after="70" w:line="240" w:lineRule="auto"/>
+        <w:spacing w:after="80"/>
         <w:pBdr>
-          <w:bottom w:val="single" w:sz="8" w:space="3" w:color="18354A"/>
+          <w:bottom w:val="single" w:sz="5" w:space="2" w:color="D6E0E7"/>
         </w:pBdr>
       </w:pPr>
       <w:hyperlink r:id="rId10">
@@ -75,7 +75,7 @@
           <w:rPr>
             <w:rFonts w:ascii="Arial" w:hAnsi="Arial" w:cs="Arial" w:eastAsia="Arial"/>
             <w:color w:val="1557A0"/>
-            <w:sz w:val="16"/>
+            <w:sz w:val="18"/>
           </w:rPr>
           <w:t xml:space="preserve">LinkedIn: linkedin.com/in/shayan-amouzadeh</w:t>
         </w:r>
@@ -84,7 +84,7 @@
         <w:rPr>
           <w:rFonts w:ascii="Arial" w:hAnsi="Arial" w:cs="Arial" w:eastAsia="Arial"/>
           <w:color w:val="5E6B75"/>
-          <w:sz w:val="16"/>
+          <w:sz w:val="17"/>
         </w:rPr>
         <w:t xml:space="preserve">  |  </w:t>
       </w:r>
@@ -93,7 +93,7 @@
           <w:rPr>
             <w:rFonts w:ascii="Arial" w:hAnsi="Arial" w:cs="Arial" w:eastAsia="Arial"/>
             <w:color w:val="1557A0"/>
-            <w:sz w:val="16"/>
+            <w:sz w:val="18"/>
           </w:rPr>
           <w:t xml:space="preserve">GitHub: github.com/Shayan-Amz</w:t>
         </w:r>
@@ -102,7 +102,7 @@
         <w:rPr>
           <w:rFonts w:ascii="Arial" w:hAnsi="Arial" w:cs="Arial" w:eastAsia="Arial"/>
           <w:color w:val="5E6B75"/>
-          <w:sz w:val="16"/>
+          <w:sz w:val="17"/>
         </w:rPr>
         <w:t xml:space="preserve">  |  </w:t>
       </w:r>
@@ -111,7 +111,7 @@
           <w:rPr>
             <w:rFonts w:ascii="Arial" w:hAnsi="Arial" w:cs="Arial" w:eastAsia="Arial"/>
             <w:color w:val="1557A0"/>
-            <w:sz w:val="16"/>
+            <w:sz w:val="18"/>
           </w:rPr>
           <w:t xml:space="preserve">Portfolio: shayan-amz.github.io</w:t>
         </w:r>
@@ -120,7 +120,7 @@
         <w:rPr>
           <w:rFonts w:ascii="Arial" w:hAnsi="Arial" w:cs="Arial" w:eastAsia="Arial"/>
           <w:color w:val="5E6B75"/>
-          <w:sz w:val="16"/>
+          <w:sz w:val="17"/>
         </w:rPr>
         <w:t xml:space="preserve">  |  </w:t>
       </w:r>
@@ -129,7 +129,7 @@
           <w:rPr>
             <w:rFonts w:ascii="Arial" w:hAnsi="Arial" w:cs="Arial" w:eastAsia="Arial"/>
             <w:color w:val="1557A0"/>
-            <w:sz w:val="16"/>
+            <w:sz w:val="18"/>
           </w:rPr>
           <w:t xml:space="preserve">ORCID: orcid.org/0009-0002-5518-1729</w:t>
         </w:r>
@@ -138,7 +138,7 @@
     <w:p>
       <w:pPr>
         <w:keepNext/>
-        <w:spacing w:before="60" w:after="60" w:line="240" w:lineRule="auto"/>
+        <w:spacing w:before="40" w:after="80" w:line="240" w:lineRule="auto"/>
         <w:pBdr>
           <w:bottom w:val="single" w:sz="5" w:space="2" w:color="D6E0E7"/>
         </w:pBdr>
@@ -148,32 +148,21 @@
           <w:rFonts w:ascii="Arial" w:hAnsi="Arial" w:cs="Arial" w:eastAsia="Arial"/>
           <w:b/>
           <w:color w:val="18354A"/>
-          <w:sz w:val="21"/>
+          <w:sz w:val="23"/>
         </w:rPr>
         <w:t>RESEARCH INTERESTS</w:t>
       </w:r>
     </w:p>
     <w:p>
       <w:pPr>
-        <w:keepLines/>
-        <w:spacing w:before="0" w:after="18" w:line="245" w:lineRule="auto"/>
-        <w:ind w:left="259" w:hanging="216"/>
+        <w:spacing w:after="40" w:line="259" w:lineRule="auto"/>
       </w:pPr>
       <w:r>
         <w:rPr>
           <w:rFonts w:ascii="Arial" w:hAnsi="Arial" w:cs="Arial" w:eastAsia="Arial"/>
           <w:b/>
-          <w:color w:val="1557A0"/>
-          <w:sz w:val="18"/>
-        </w:rPr>
-        <w:t xml:space="preserve">• </w:t>
-      </w:r>
-      <w:r>
-        <w:rPr>
-          <w:rFonts w:ascii="Arial" w:hAnsi="Arial" w:cs="Arial" w:eastAsia="Arial"/>
-          <w:b/>
-          <w:color w:val="202B35"/>
-          <w:sz w:val="18"/>
+          <w:color w:val="18354A"/>
+          <w:sz w:val="20"/>
         </w:rPr>
         <w:t xml:space="preserve">AI &amp; Machine Learning: </w:t>
       </w:r>
@@ -181,32 +170,24 @@
         <w:rPr>
           <w:rFonts w:ascii="Arial" w:hAnsi="Arial" w:cs="Arial" w:eastAsia="Arial"/>
           <w:color w:val="202B35"/>
-          <w:sz w:val="18"/>
+          <w:sz w:val="20"/>
         </w:rPr>
-        <w:t>Large Language Models (LLMs), Natural Language Processing (NLP), multimodal speech-to-text pipelines, and information retrieval.</w:t>
+        <w:t>LLMs, NLP, multimodal speech-to-text, and information retrieval.</w:t>
       </w:r>
-    </w:p>
-    <w:p>
-      <w:pPr>
-        <w:keepLines/>
-        <w:spacing w:before="0" w:after="18" w:line="245" w:lineRule="auto"/>
-        <w:ind w:left="259" w:hanging="216"/>
-      </w:pPr>
       <w:r>
         <w:rPr>
           <w:rFonts w:ascii="Arial" w:hAnsi="Arial" w:cs="Arial" w:eastAsia="Arial"/>
-          <w:b/>
-          <w:color w:val="1557A0"/>
-          <w:sz w:val="18"/>
+          <w:color w:val="202B35"/>
+          <w:sz w:val="20"/>
         </w:rPr>
-        <w:t xml:space="preserve">• </w:t>
+        <w:t xml:space="preserve">  </w:t>
       </w:r>
       <w:r>
         <w:rPr>
           <w:rFonts w:ascii="Arial" w:hAnsi="Arial" w:cs="Arial" w:eastAsia="Arial"/>
           <w:b/>
-          <w:color w:val="202B35"/>
-          <w:sz w:val="18"/>
+          <w:color w:val="18354A"/>
+          <w:sz w:val="20"/>
         </w:rPr>
         <w:t xml:space="preserve">Software Engineering &amp; Computer Systems: </w:t>
       </w:r>
@@ -214,7 +195,7 @@
         <w:rPr>
           <w:rFonts w:ascii="Arial" w:hAnsi="Arial" w:cs="Arial" w:eastAsia="Arial"/>
           <w:color w:val="202B35"/>
-          <w:sz w:val="18"/>
+          <w:sz w:val="20"/>
         </w:rPr>
         <w:t>Automated testing and formal verification, high-performance and deterministic computing, computer graphics, and secure web architectures.</w:t>
       </w:r>
@@ -222,7 +203,7 @@
     <w:p>
       <w:pPr>
         <w:keepNext/>
-        <w:spacing w:before="110" w:after="60" w:line="240" w:lineRule="auto"/>
+        <w:spacing w:before="120" w:after="80" w:line="240" w:lineRule="auto"/>
         <w:pBdr>
           <w:bottom w:val="single" w:sz="5" w:space="2" w:color="D6E0E7"/>
         </w:pBdr>
@@ -232,7 +213,7 @@
           <w:rFonts w:ascii="Arial" w:hAnsi="Arial" w:cs="Arial" w:eastAsia="Arial"/>
           <w:b/>
           <w:color w:val="18354A"/>
-          <w:sz w:val="21"/>
+          <w:sz w:val="23"/>
         </w:rPr>
         <w:t>EDUCATION</w:t>
       </w:r>
@@ -240,94 +221,98 @@
     <w:p>
       <w:pPr>
         <w:keepNext/>
-        <w:tabs>
-          <w:tab w:pos="10296" w:val="right"/>
-        </w:tabs>
-        <w:spacing w:after="8"/>
+        <w:spacing w:after="10"/>
       </w:pPr>
       <w:r>
         <w:rPr>
           <w:rFonts w:ascii="Arial" w:hAnsi="Arial" w:cs="Arial" w:eastAsia="Arial"/>
           <w:b/>
           <w:color w:val="18354A"/>
-          <w:sz w:val="19"/>
+          <w:sz w:val="20"/>
         </w:rPr>
         <w:t>B.Sc. in Computer Engineering (Software Engineering Specialization)</w:t>
-      </w:r>
-      <w:r>
-        <w:rPr>
-          <w:rFonts w:ascii="Arial" w:hAnsi="Arial" w:cs="Arial" w:eastAsia="Arial"/>
-          <w:b/>
-          <w:color w:val="5E6B75"/>
-          <w:sz w:val="17"/>
-        </w:rPr>
-        <w:tab/>
-        <w:t>Sep 2022 – Sep 2026</w:t>
       </w:r>
     </w:p>
     <w:p>
       <w:pPr>
         <w:keepNext/>
-        <w:spacing w:after="16"/>
+        <w:spacing w:after="20"/>
       </w:pPr>
       <w:r>
         <w:rPr>
           <w:rFonts w:ascii="Arial" w:hAnsi="Arial" w:cs="Arial" w:eastAsia="Arial"/>
           <w:i/>
           <w:color w:val="5E6B75"/>
-          <w:sz w:val="17"/>
+          <w:sz w:val="18"/>
         </w:rPr>
         <w:t>Semnan University, Faculty of Electrical and Computer Engineering | Semnan, Iran</w:t>
       </w:r>
     </w:p>
     <w:p>
       <w:pPr>
-        <w:spacing w:after="16" w:line="240" w:lineRule="auto"/>
+        <w:spacing w:after="30" w:line="247" w:lineRule="auto"/>
       </w:pPr>
       <w:r>
         <w:rPr>
           <w:rFonts w:ascii="Arial" w:hAnsi="Arial" w:cs="Arial" w:eastAsia="Arial"/>
           <w:b/>
-          <w:color w:val="202B35"/>
-          <w:sz w:val="17"/>
+          <w:color w:val="18354A"/>
+          <w:sz w:val="18"/>
         </w:rPr>
-        <w:t xml:space="preserve">Academic record: </w:t>
+        <w:t xml:space="preserve">Study period: </w:t>
       </w:r>
       <w:r>
         <w:rPr>
           <w:rFonts w:ascii="Arial" w:hAnsi="Arial" w:cs="Arial" w:eastAsia="Arial"/>
           <w:color w:val="202B35"/>
-          <w:sz w:val="17"/>
+          <w:sz w:val="18"/>
         </w:rPr>
-        <w:t>Cumulative 15.77/20  |  Last 2 years 16.93/20  |  Final year 17.03/20  |  Selected core CS/CE average 18.03/20 (21 courses). Grades on a 20-point scale.</w:t>
+        <w:t xml:space="preserve">Sep 2022 – Sep 2026  |  </w:t>
+      </w:r>
+      <w:r>
+        <w:rPr>
+          <w:rFonts w:ascii="Arial" w:hAnsi="Arial" w:cs="Arial" w:eastAsia="Arial"/>
+          <w:b/>
+          <w:color w:val="18354A"/>
+          <w:sz w:val="18"/>
+        </w:rPr>
+        <w:t xml:space="preserve">GPA (20-point scale): </w:t>
+      </w:r>
+      <w:r>
+        <w:rPr>
+          <w:rFonts w:ascii="Arial" w:hAnsi="Arial" w:cs="Arial" w:eastAsia="Arial"/>
+          <w:color w:val="202B35"/>
+          <w:sz w:val="18"/>
+        </w:rPr>
+        <w:t>15.77/20 cumulative; 16.93/20 (last 2 years); 17.03/20 (final year); 18.03/20 across 21 selected core CS/CE courses.</w:t>
       </w:r>
     </w:p>
     <w:p>
       <w:pPr>
-        <w:spacing w:after="22" w:line="240" w:lineRule="auto"/>
+        <w:spacing w:after="30" w:line="247" w:lineRule="auto"/>
       </w:pPr>
       <w:r>
         <w:rPr>
           <w:rFonts w:ascii="Arial" w:hAnsi="Arial" w:cs="Arial" w:eastAsia="Arial"/>
           <w:b/>
-          <w:color w:val="202B35"/>
-          <w:sz w:val="17"/>
+          <w:color w:val="18354A"/>
+          <w:sz w:val="18"/>
         </w:rPr>
-        <w:t xml:space="preserve">Selected coursework (grade / 20): </w:t>
+        <w:t xml:space="preserve">Selected coursework: </w:t>
       </w:r>
       <w:r>
         <w:rPr>
           <w:rFonts w:ascii="Arial" w:hAnsi="Arial" w:cs="Arial" w:eastAsia="Arial"/>
           <w:color w:val="202B35"/>
-          <w:sz w:val="17"/>
+          <w:sz w:val="18"/>
         </w:rPr>
-        <w:t>Information Technology (20.00), Programming Languages Design (19.50), Computer Networks Lab (19.50), Software Engineering (19.25), Operating Systems Lab (19.25), Web Programming (18.50), Linear Algebra (18.00), Data Structures &amp; Algorithms (17.50).</w:t>
+        <w:t>Programming Languages Design (19.50), Software Engineering (19.25), Operating Systems Lab (19.25), Linear Algebra (18.00), Data Structures &amp; Algorithms (17.50).</w:t>
       </w:r>
     </w:p>
     <w:p>
       <w:pPr>
         <w:keepNext/>
-        <w:spacing w:before="110" w:after="60" w:line="240" w:lineRule="auto"/>
+        <w:spacing w:before="120" w:after="80" w:line="240" w:lineRule="auto"/>
         <w:pBdr>
           <w:bottom w:val="single" w:sz="5" w:space="2" w:color="D6E0E7"/>
         </w:pBdr>
@@ -337,7 +322,7 @@
           <w:rFonts w:ascii="Arial" w:hAnsi="Arial" w:cs="Arial" w:eastAsia="Arial"/>
           <w:b/>
           <w:color w:val="18354A"/>
-          <w:sz w:val="21"/>
+          <w:sz w:val="23"/>
         </w:rPr>
         <w:t>UNDERGRADUATE THESIS &amp; CAPSTONE PROJECT</w:t>
       </w:r>
@@ -352,24 +337,9 @@
           <w:rFonts w:ascii="Arial" w:hAnsi="Arial" w:cs="Arial" w:eastAsia="Arial"/>
           <w:b/>
           <w:color w:val="18354A"/>
-          <w:sz w:val="18"/>
+          <w:sz w:val="20"/>
         </w:rPr>
         <w:t>Developer &amp; System Architect — Intelligent Real Estate CRM Platform</w:t>
-      </w:r>
-    </w:p>
-    <w:p>
-      <w:pPr>
-        <w:keepNext/>
-        <w:spacing w:after="16"/>
-      </w:pPr>
-      <w:r>
-        <w:rPr>
-          <w:rFonts w:ascii="Arial" w:hAnsi="Arial" w:cs="Arial" w:eastAsia="Arial"/>
-          <w:i/>
-          <w:color w:val="5E6B75"/>
-          <w:sz w:val="16"/>
-        </w:rPr>
-        <w:t>B.Sc. Thesis: Design &amp; Implementation of an Intelligent Real Estate Management System  |  Grade: 19.50/20  |  Advisor: Dr. Morteza Dorrigiv, Semnan University  |  B.Sc. Capstone Project</w:t>
       </w:r>
     </w:p>
     <w:p>
@@ -380,8 +350,23 @@
       <w:r>
         <w:rPr>
           <w:rFonts w:ascii="Arial" w:hAnsi="Arial" w:cs="Arial" w:eastAsia="Arial"/>
+          <w:i/>
           <w:color w:val="5E6B75"/>
-          <w:sz w:val="17"/>
+          <w:sz w:val="18"/>
+        </w:rPr>
+        <w:t>B.Sc. Thesis: Design &amp; Implementation of an Intelligent Real Estate Management System  |  Grade: 19.50/20  |  Advisor: Dr. Morteza Dorrigiv, Semnan University</w:t>
+      </w:r>
+    </w:p>
+    <w:p>
+      <w:pPr>
+        <w:keepNext/>
+        <w:spacing w:after="30"/>
+      </w:pPr>
+      <w:r>
+        <w:rPr>
+          <w:rFonts w:ascii="Arial" w:hAnsi="Arial" w:cs="Arial" w:eastAsia="Arial"/>
+          <w:color w:val="5E6B75"/>
+          <w:sz w:val="18"/>
         </w:rPr>
         <w:t xml:space="preserve">Live project: </w:t>
       </w:r>
@@ -390,7 +375,7 @@
           <w:rPr>
             <w:rFonts w:ascii="Arial" w:hAnsi="Arial" w:cs="Arial" w:eastAsia="Arial"/>
             <w:color w:val="1557A0"/>
-            <w:sz w:val="17"/>
+            <w:sz w:val="18"/>
           </w:rPr>
           <w:t xml:space="preserve">amlak-e-man.ir</w:t>
         </w:r>
@@ -399,7 +384,7 @@
         <w:rPr>
           <w:rFonts w:ascii="Arial" w:hAnsi="Arial" w:cs="Arial" w:eastAsia="Arial"/>
           <w:color w:val="5E6B75"/>
-          <w:sz w:val="17"/>
+          <w:sz w:val="18"/>
         </w:rPr>
         <w:t xml:space="preserve">  |  GitHub: </w:t>
       </w:r>
@@ -408,7 +393,7 @@
           <w:rPr>
             <w:rFonts w:ascii="Arial" w:hAnsi="Arial" w:cs="Arial" w:eastAsia="Arial"/>
             <w:color w:val="1557A0"/>
-            <w:sz w:val="17"/>
+            <w:sz w:val="18"/>
           </w:rPr>
           <w:t xml:space="preserve">Real-Estate-File-Manager-Project</w:t>
         </w:r>
@@ -417,15 +402,15 @@
     <w:p>
       <w:pPr>
         <w:keepLines/>
-        <w:spacing w:before="0" w:after="23" w:line="245" w:lineRule="auto"/>
-        <w:ind w:left="259" w:hanging="216"/>
+        <w:spacing w:after="60" w:line="259" w:lineRule="auto"/>
+        <w:ind w:left="274" w:hanging="230"/>
       </w:pPr>
       <w:r>
         <w:rPr>
           <w:rFonts w:ascii="Arial" w:hAnsi="Arial" w:cs="Arial" w:eastAsia="Arial"/>
           <w:b/>
           <w:color w:val="1557A0"/>
-          <w:sz w:val="17"/>
+          <w:sz w:val="19"/>
         </w:rPr>
         <w:t xml:space="preserve">• </w:t>
       </w:r>
@@ -434,31 +419,31 @@
           <w:rFonts w:ascii="Arial" w:hAnsi="Arial" w:cs="Arial" w:eastAsia="Arial"/>
           <w:b/>
           <w:color w:val="202B35"/>
-          <w:sz w:val="17"/>
+          <w:sz w:val="19"/>
         </w:rPr>
-        <w:t xml:space="preserve">Multi-tenant architecture &amp; RBAC: </w:t>
+        <w:t xml:space="preserve">Architecture: </w:t>
       </w:r>
       <w:r>
         <w:rPr>
           <w:rFonts w:ascii="Arial" w:hAnsi="Arial" w:cs="Arial" w:eastAsia="Arial"/>
           <w:color w:val="202B35"/>
-          <w:sz w:val="17"/>
+          <w:sz w:val="19"/>
         </w:rPr>
-        <w:t>Architected and deployed a production CRM using PHP/PDO, a 7-table MySQL schema, 17 REST action handlers, and a zero-dependency vanilla-JavaScript PWA. Implemented version-gated runtime migrations, composite indexing, a 15-second change-token synchronization protocol, and three-role RBAC across three commercial tiers.</w:t>
+        <w:t>Built and deployed a multi-tenant CRM with PHP/PDO, a 7-table MySQL schema, 17 REST handlers, and a vanilla-JavaScript PWA; added runtime migrations, role-based access, composite indexes, and 15-second change-token synchronization.</w:t>
       </w:r>
     </w:p>
     <w:p>
       <w:pPr>
         <w:keepLines/>
-        <w:spacing w:before="0" w:after="23" w:line="245" w:lineRule="auto"/>
-        <w:ind w:left="259" w:hanging="216"/>
+        <w:spacing w:after="60" w:line="259" w:lineRule="auto"/>
+        <w:ind w:left="274" w:hanging="230"/>
       </w:pPr>
       <w:r>
         <w:rPr>
           <w:rFonts w:ascii="Arial" w:hAnsi="Arial" w:cs="Arial" w:eastAsia="Arial"/>
           <w:b/>
           <w:color w:val="1557A0"/>
-          <w:sz w:val="17"/>
+          <w:sz w:val="19"/>
         </w:rPr>
         <w:t xml:space="preserve">• </w:t>
       </w:r>
@@ -467,56 +452,23 @@
           <w:rFonts w:ascii="Arial" w:hAnsi="Arial" w:cs="Arial" w:eastAsia="Arial"/>
           <w:b/>
           <w:color w:val="202B35"/>
-          <w:sz w:val="17"/>
+          <w:sz w:val="19"/>
         </w:rPr>
-        <w:t xml:space="preserve">Voice and LLM extraction: </w:t>
+        <w:t xml:space="preserve">Applied AI &amp; security: </w:t>
       </w:r>
       <w:r>
         <w:rPr>
           <w:rFonts w:ascii="Arial" w:hAnsi="Arial" w:cs="Arial" w:eastAsia="Arial"/>
           <w:color w:val="202B35"/>
-          <w:sz w:val="17"/>
+          <w:sz w:val="19"/>
         </w:rPr>
-        <w:t>Built a human-reviewed Persian voice-to-form pipeline: browser-recorded 16 kHz mono PCM-16 WAV, provider-switchable Whisper-large-v3 speech recognition (Hugging Face, Groq, OpenAI), and OpenRouter LLM extraction. Added a 16-rule Persian JSON contract, prompt-injection guardrails, a 26-field server allow-list, and client-side spoken-number/currency normalization.</w:t>
-      </w:r>
-    </w:p>
-    <w:p>
-      <w:pPr>
-        <w:keepLines/>
-        <w:spacing w:before="0" w:after="23" w:line="245" w:lineRule="auto"/>
-        <w:ind w:left="259" w:hanging="216"/>
-      </w:pPr>
-      <w:r>
-        <w:rPr>
-          <w:rFonts w:ascii="Arial" w:hAnsi="Arial" w:cs="Arial" w:eastAsia="Arial"/>
-          <w:b/>
-          <w:color w:val="1557A0"/>
-          <w:sz w:val="17"/>
-        </w:rPr>
-        <w:t xml:space="preserve">• </w:t>
-      </w:r>
-      <w:r>
-        <w:rPr>
-          <w:rFonts w:ascii="Arial" w:hAnsi="Arial" w:cs="Arial" w:eastAsia="Arial"/>
-          <w:b/>
-          <w:color w:val="202B35"/>
-          <w:sz w:val="17"/>
-        </w:rPr>
-        <w:t xml:space="preserve">Matching, security &amp; evaluation: </w:t>
-      </w:r>
-      <w:r>
-        <w:rPr>
-          <w:rFonts w:ascii="Arial" w:hAnsi="Arial" w:cs="Arial" w:eastAsia="Arial"/>
-          <w:color w:val="202B35"/>
-          <w:sz w:val="17"/>
-        </w:rPr>
-        <w:t>Implemented O(P) demand/property matching with normalized bidirectional city matching, ±15% area tolerance, three-mode budget constraints, and lazy-loaded Neshan Leaflet geocoding/deep links. Added 30-hour tenant-bound HMAC-SHA256 tokens with constant-time verification, per-request consultant revocation, SHA-256-masked guest-response tenant IDs, a 150 requests/minute sliding-window limiter, dual-stage image watermarking/sanitization, 47 tests, and an offline Persian WER/F1 console secured by HS256 JWTs (RFC 7519).</w:t>
+        <w:t>Added human-reviewed Persian voice entry using Whisper-large-v3 and OpenRouter LLM extraction, plus property matching and Neshan maps; implemented tenant-bound HMAC-SHA256 authentication, rate limiting, and 47 automated tests.</w:t>
       </w:r>
     </w:p>
     <w:p>
       <w:pPr>
         <w:keepNext/>
-        <w:spacing w:before="110" w:after="60" w:line="240" w:lineRule="auto"/>
+        <w:spacing w:before="120" w:after="80" w:line="240" w:lineRule="auto"/>
         <w:pBdr>
           <w:bottom w:val="single" w:sz="5" w:space="2" w:color="D6E0E7"/>
         </w:pBdr>
@@ -526,7 +478,7 @@
           <w:rFonts w:ascii="Arial" w:hAnsi="Arial" w:cs="Arial" w:eastAsia="Arial"/>
           <w:b/>
           <w:color w:val="18354A"/>
-          <w:sz w:val="21"/>
+          <w:sz w:val="23"/>
         </w:rPr>
         <w:t>SELECTED TECHNICAL PROJECTS</w:t>
       </w:r>
@@ -534,14 +486,14 @@
     <w:p>
       <w:pPr>
         <w:keepNext/>
-        <w:spacing w:before="40" w:after="2" w:line="240" w:lineRule="auto"/>
+        <w:spacing w:before="80" w:after="0"/>
       </w:pPr>
       <w:r>
         <w:rPr>
           <w:rFonts w:ascii="Arial" w:hAnsi="Arial" w:cs="Arial" w:eastAsia="Arial"/>
           <w:b/>
           <w:color w:val="18354A"/>
-          <w:sz w:val="18"/>
+          <w:sz w:val="20"/>
         </w:rPr>
         <w:t>IEEE 754 Single-Precision Floating-Point Unit</w:t>
       </w:r>
@@ -549,14 +501,14 @@
     <w:p>
       <w:pPr>
         <w:keepNext/>
-        <w:spacing w:before="0" w:after="12" w:line="240" w:lineRule="auto"/>
+        <w:spacing w:after="30"/>
       </w:pPr>
       <w:r>
         <w:rPr>
           <w:rFonts w:ascii="Arial" w:hAnsi="Arial" w:cs="Arial" w:eastAsia="Arial"/>
           <w:i/>
           <w:color w:val="5E6B75"/>
-          <w:sz w:val="16"/>
+          <w:sz w:val="18"/>
         </w:rPr>
         <w:t xml:space="preserve">C++17 · CMake · Hardware Arithmetic Verification  |  </w:t>
       </w:r>
@@ -565,7 +517,7 @@
           <w:rPr>
             <w:rFonts w:ascii="Arial" w:hAnsi="Arial" w:cs="Arial" w:eastAsia="Arial"/>
             <w:color w:val="1557A0"/>
-            <w:sz w:val="16"/>
+            <w:sz w:val="18"/>
           </w:rPr>
           <w:t xml:space="preserve">GitHub</w:t>
         </w:r>
@@ -574,80 +526,38 @@
     <w:p>
       <w:pPr>
         <w:keepLines/>
-        <w:spacing w:before="0" w:after="24" w:line="245" w:lineRule="auto"/>
-        <w:ind w:left="259" w:hanging="216"/>
+        <w:spacing w:after="60" w:line="259" w:lineRule="auto"/>
+        <w:ind w:left="274" w:hanging="230"/>
       </w:pPr>
       <w:r>
         <w:rPr>
           <w:rFonts w:ascii="Arial" w:hAnsi="Arial" w:cs="Arial" w:eastAsia="Arial"/>
           <w:b/>
           <w:color w:val="1557A0"/>
-          <w:sz w:val="17"/>
+          <w:sz w:val="20"/>
         </w:rPr>
         <w:t xml:space="preserve">• </w:t>
       </w:r>
       <w:r>
         <w:rPr>
           <w:rFonts w:ascii="Arial" w:hAnsi="Arial" w:cs="Arial" w:eastAsia="Arial"/>
-          <w:b/>
           <w:color w:val="202B35"/>
-          <w:sz w:val="17"/>
+          <w:sz w:val="20"/>
         </w:rPr>
-        <w:t xml:space="preserve">Implementation: </w:t>
-      </w:r>
-      <w:r>
-        <w:rPr>
-          <w:rFonts w:ascii="Arial" w:hAnsi="Arial" w:cs="Arial" w:eastAsia="Arial"/>
-          <w:color w:val="202B35"/>
-          <w:sz w:val="17"/>
-        </w:rPr>
-        <w:t>Built a bit-exact, compile-time (constexpr) C++17 binary32 model for addition, subtraction, multiplication, and division, including all four IEEE 754 rounding modes, subnormals, signed zeros, infinities, NaN propagation, and bitwise trace inspection.</w:t>
-      </w:r>
-    </w:p>
-    <w:p>
-      <w:pPr>
-        <w:keepLines/>
-        <w:spacing w:before="0" w:after="24" w:line="245" w:lineRule="auto"/>
-        <w:ind w:left="259" w:hanging="216"/>
-      </w:pPr>
-      <w:r>
-        <w:rPr>
-          <w:rFonts w:ascii="Arial" w:hAnsi="Arial" w:cs="Arial" w:eastAsia="Arial"/>
-          <w:b/>
-          <w:color w:val="1557A0"/>
-          <w:sz w:val="17"/>
-        </w:rPr>
-        <w:t xml:space="preserve">• </w:t>
-      </w:r>
-      <w:r>
-        <w:rPr>
-          <w:rFonts w:ascii="Arial" w:hAnsi="Arial" w:cs="Arial" w:eastAsia="Arial"/>
-          <w:b/>
-          <w:color w:val="202B35"/>
-          <w:sz w:val="17"/>
-        </w:rPr>
-        <w:t xml:space="preserve">Verification: </w:t>
-      </w:r>
-      <w:r>
-        <w:rPr>
-          <w:rFonts w:ascii="Arial" w:hAnsi="Arial" w:cs="Arial" w:eastAsia="Arial"/>
-          <w:color w:val="202B35"/>
-          <w:sz w:val="17"/>
-        </w:rPr>
-        <w:t>Differential-tested against the host FPU under fesetround(): 32,026,992 operand-pair checks with zero mismatches, enforced on GCC/Clang/AppleClang/MSVC CI. Improved an initial course adder from 58.2% bit-exact (1.4M samples) to 100% using sticky-bit alignment, round-to-nearest-even, and gradual underflow.</w:t>
+        <w:t>Built a constexpr binary32 model for addition, subtraction, multiplication, and division. Differential testing passed 32,026,992 operand-pair checks with zero mismatches across GCC, Clang, AppleClang, and MSVC CI.</w:t>
       </w:r>
     </w:p>
     <w:p>
       <w:pPr>
         <w:keepNext/>
-        <w:spacing w:before="40" w:after="2" w:line="240" w:lineRule="auto"/>
+        <w:spacing w:before="80" w:after="0"/>
       </w:pPr>
       <w:r>
         <w:rPr>
           <w:rFonts w:ascii="Arial" w:hAnsi="Arial" w:cs="Arial" w:eastAsia="Arial"/>
           <w:b/>
           <w:color w:val="18354A"/>
-          <w:sz w:val="18"/>
+          <w:sz w:val="20"/>
         </w:rPr>
         <w:t>Deterministic Graphics Pipeline &amp; CPU Software Rasterizer</w:t>
       </w:r>
@@ -655,23 +565,23 @@
     <w:p>
       <w:pPr>
         <w:keepNext/>
-        <w:spacing w:before="0" w:after="12" w:line="240" w:lineRule="auto"/>
+        <w:spacing w:after="30"/>
       </w:pPr>
       <w:r>
         <w:rPr>
           <w:rFonts w:ascii="Arial" w:hAnsi="Arial" w:cs="Arial" w:eastAsia="Arial"/>
           <w:i/>
           <w:color w:val="5E6B75"/>
-          <w:sz w:val="16"/>
+          <w:sz w:val="18"/>
         </w:rPr>
-        <w:t xml:space="preserve">C++17 · C99 · OpenGL 1.1 · FreeGLUT · Computer Graphics  |  </w:t>
+        <w:t xml:space="preserve">C++17 · C99 · OpenGL 1.1 · FreeGLUT  |  </w:t>
       </w:r>
       <w:hyperlink r:id="rId17">
         <w:r>
           <w:rPr>
             <w:rFonts w:ascii="Arial" w:hAnsi="Arial" w:cs="Arial" w:eastAsia="Arial"/>
             <w:color w:val="1557A0"/>
-            <w:sz w:val="16"/>
+            <w:sz w:val="18"/>
           </w:rPr>
           <w:t xml:space="preserve">GitHub</w:t>
         </w:r>
@@ -680,67 +590,25 @@
     <w:p>
       <w:pPr>
         <w:keepLines/>
-        <w:spacing w:before="0" w:after="24" w:line="245" w:lineRule="auto"/>
-        <w:ind w:left="259" w:hanging="216"/>
+        <w:spacing w:after="60" w:line="259" w:lineRule="auto"/>
+        <w:ind w:left="274" w:hanging="230"/>
       </w:pPr>
       <w:r>
         <w:rPr>
           <w:rFonts w:ascii="Arial" w:hAnsi="Arial" w:cs="Arial" w:eastAsia="Arial"/>
           <w:b/>
           <w:color w:val="1557A0"/>
-          <w:sz w:val="17"/>
+          <w:sz w:val="20"/>
         </w:rPr>
         <w:t xml:space="preserve">• </w:t>
       </w:r>
       <w:r>
         <w:rPr>
           <w:rFonts w:ascii="Arial" w:hAnsi="Arial" w:cs="Arial" w:eastAsia="Arial"/>
-          <w:b/>
           <w:color w:val="202B35"/>
-          <w:sz w:val="17"/>
+          <w:sz w:val="20"/>
         </w:rPr>
-        <w:t xml:space="preserve">Architecture &amp; rasterization: </w:t>
-      </w:r>
-      <w:r>
-        <w:rPr>
-          <w:rFonts w:ascii="Arial" w:hAnsi="Arial" w:cs="Arial" w:eastAsia="Arial"/>
-          <w:color w:val="202B35"/>
-          <w:sz w:val="17"/>
-        </w:rPr>
-        <w:t>Refactored an animated OpenGL scene into decoupled AnimationState and pure render() components. Authored softgl, a C99 deterministic rasterizer with 49 GL/GLUT entry points, Pineda half-space edge functions, pixel-center sampling, top-left fill, DDA lines, and Gouraud shading; verified with 28 self-test assertions.</w:t>
-      </w:r>
-    </w:p>
-    <w:p>
-      <w:pPr>
-        <w:keepLines/>
-        <w:spacing w:before="0" w:after="24" w:line="245" w:lineRule="auto"/>
-        <w:ind w:left="259" w:hanging="216"/>
-      </w:pPr>
-      <w:r>
-        <w:rPr>
-          <w:rFonts w:ascii="Arial" w:hAnsi="Arial" w:cs="Arial" w:eastAsia="Arial"/>
-          <w:b/>
-          <w:color w:val="1557A0"/>
-          <w:sz w:val="17"/>
-        </w:rPr>
-        <w:t xml:space="preserve">• </w:t>
-      </w:r>
-      <w:r>
-        <w:rPr>
-          <w:rFonts w:ascii="Arial" w:hAnsi="Arial" w:cs="Arial" w:eastAsia="Arial"/>
-          <w:b/>
-          <w:color w:val="202B35"/>
-          <w:sz w:val="17"/>
-        </w:rPr>
-        <w:t xml:space="preserve">Cross-platform testing: </w:t>
-      </w:r>
-      <w:r>
-        <w:rPr>
-          <w:rFonts w:ascii="Arial" w:hAnsi="Arial" w:cs="Arial" w:eastAsia="Arial"/>
-          <w:color w:val="202B35"/>
-          <w:sz w:val="17"/>
-        </w:rPr>
-        <w:t>Enforced pixel-exact CI across four scenes and GCC, AppleClang, and MSVC (up to 7,017 triangles and 1.26M fragments/frame at 1300×650). Resolved an ARM64 FMA-contraction discrepancy and removed 605 legacy OpenGL errors per frame.</w:t>
+        <w:t>Refactored an animated OpenGL scene and built a deterministic C99 rasterizer with 49 GL/GLUT entry points. Added pixel-exact regression tests across three operating systems, resolved an ARM64 FMA discrepancy, and removed 605 legacy GL errors per frame.</w:t>
       </w:r>
     </w:p>
     <w:p>
@@ -751,7 +619,7 @@
     <w:p>
       <w:pPr>
         <w:keepNext/>
-        <w:spacing w:before="0" w:after="60" w:line="240" w:lineRule="auto"/>
+        <w:spacing w:before="0" w:after="80" w:line="240" w:lineRule="auto"/>
         <w:pBdr>
           <w:bottom w:val="single" w:sz="5" w:space="2" w:color="D6E0E7"/>
         </w:pBdr>
@@ -761,7 +629,7 @@
           <w:rFonts w:ascii="Arial" w:hAnsi="Arial" w:cs="Arial" w:eastAsia="Arial"/>
           <w:b/>
           <w:color w:val="18354A"/>
-          <w:sz w:val="21"/>
+          <w:sz w:val="23"/>
         </w:rPr>
         <w:t>SELECTED TECHNICAL PROJECTS (CONTINUED)</w:t>
       </w:r>
@@ -769,14 +637,14 @@
     <w:p>
       <w:pPr>
         <w:keepNext/>
-        <w:spacing w:before="40" w:after="2" w:line="240" w:lineRule="auto"/>
+        <w:spacing w:before="80" w:after="0"/>
       </w:pPr>
       <w:r>
         <w:rPr>
           <w:rFonts w:ascii="Arial" w:hAnsi="Arial" w:cs="Arial" w:eastAsia="Arial"/>
           <w:b/>
           <w:color w:val="18354A"/>
-          <w:sz w:val="18"/>
+          <w:sz w:val="20"/>
         </w:rPr>
         <w:t>Bare-Metal ARMv7-A VGA Framebuffer Renderer</w:t>
       </w:r>
@@ -784,14 +652,14 @@
     <w:p>
       <w:pPr>
         <w:keepNext/>
-        <w:spacing w:before="0" w:after="12" w:line="240" w:lineRule="auto"/>
+        <w:spacing w:after="30"/>
       </w:pPr>
       <w:r>
         <w:rPr>
           <w:rFonts w:ascii="Arial" w:hAnsi="Arial" w:cs="Arial" w:eastAsia="Arial"/>
           <w:i/>
           <w:color w:val="5E6B75"/>
-          <w:sz w:val="16"/>
+          <w:sz w:val="18"/>
         </w:rPr>
         <w:t xml:space="preserve">ARMv7-A Assembly · Python · Unicorn CPU Emulation  |  </w:t>
       </w:r>
@@ -800,7 +668,7 @@
           <w:rPr>
             <w:rFonts w:ascii="Arial" w:hAnsi="Arial" w:cs="Arial" w:eastAsia="Arial"/>
             <w:color w:val="1557A0"/>
-            <w:sz w:val="16"/>
+            <w:sz w:val="18"/>
           </w:rPr>
           <w:t xml:space="preserve">GitHub</w:t>
         </w:r>
@@ -809,80 +677,38 @@
     <w:p>
       <w:pPr>
         <w:keepLines/>
-        <w:spacing w:before="0" w:after="24" w:line="245" w:lineRule="auto"/>
-        <w:ind w:left="259" w:hanging="216"/>
+        <w:spacing w:after="60" w:line="259" w:lineRule="auto"/>
+        <w:ind w:left="274" w:hanging="230"/>
       </w:pPr>
       <w:r>
         <w:rPr>
           <w:rFonts w:ascii="Arial" w:hAnsi="Arial" w:cs="Arial" w:eastAsia="Arial"/>
           <w:b/>
           <w:color w:val="1557A0"/>
-          <w:sz w:val="17"/>
+          <w:sz w:val="20"/>
         </w:rPr>
         <w:t xml:space="preserve">• </w:t>
       </w:r>
       <w:r>
         <w:rPr>
           <w:rFonts w:ascii="Arial" w:hAnsi="Arial" w:cs="Arial" w:eastAsia="Arial"/>
-          <w:b/>
           <w:color w:val="202B35"/>
-          <w:sz w:val="17"/>
+          <w:sz w:val="20"/>
         </w:rPr>
-        <w:t xml:space="preserve">Renderer &amp; validation: </w:t>
-      </w:r>
-      <w:r>
-        <w:rPr>
-          <w:rFonts w:ascii="Arial" w:hAnsi="Arial" w:cs="Arial" w:eastAsia="Arial"/>
-          <w:color w:val="202B35"/>
-          <w:sz w:val="17"/>
-        </w:rPr>
-        <w:t>Wrote a bare-metal ARMv7-A renderer for the DE1-SoC 320×240 RGB565 memory-mapped VGA framebuffer (0xC8000000), using an AAPCS-compliant leaf routine and paired 16-bit pixel stores. Instrumented GNU and Zig builds with Python Unicorn in CI; verified exact 80/80/80 stripe geometry, clean halt, and zero out-of-bounds stores.</w:t>
-      </w:r>
-    </w:p>
-    <w:p>
-      <w:pPr>
-        <w:keepLines/>
-        <w:spacing w:before="0" w:after="24" w:line="245" w:lineRule="auto"/>
-        <w:ind w:left="259" w:hanging="216"/>
-      </w:pPr>
-      <w:r>
-        <w:rPr>
-          <w:rFonts w:ascii="Arial" w:hAnsi="Arial" w:cs="Arial" w:eastAsia="Arial"/>
-          <w:b/>
-          <w:color w:val="1557A0"/>
-          <w:sz w:val="17"/>
-        </w:rPr>
-        <w:t xml:space="preserve">• </w:t>
-      </w:r>
-      <w:r>
-        <w:rPr>
-          <w:rFonts w:ascii="Arial" w:hAnsi="Arial" w:cs="Arial" w:eastAsia="Arial"/>
-          <w:b/>
-          <w:color w:val="202B35"/>
-          <w:sz w:val="17"/>
-        </w:rPr>
-        <w:t xml:space="preserve">Optimization: </w:t>
-      </w:r>
-      <w:r>
-        <w:rPr>
-          <w:rFonts w:ascii="Arial" w:hAnsi="Arial" w:cs="Arial" w:eastAsia="Arial"/>
-          <w:color w:val="202B35"/>
-          <w:sz w:val="17"/>
-        </w:rPr>
-        <w:t>Reduced executed instructions from 353,286 to 116,201 (−67%; 3.04×), eliminating 9,216 out-of-bounds writes and 46,080 redundant padding writes.</w:t>
+        <w:t>Implemented an RGB565 renderer for the DE1-SoC memory-mapped VGA framebuffer. Unicorn CI verified output with zero out-of-bounds writes; optimization reduced instructions by 67% (353,286 to 116,201).</w:t>
       </w:r>
     </w:p>
     <w:p>
       <w:pPr>
         <w:keepNext/>
-        <w:spacing w:before="40" w:after="2" w:line="240" w:lineRule="auto"/>
+        <w:spacing w:before="80" w:after="0"/>
       </w:pPr>
       <w:r>
         <w:rPr>
           <w:rFonts w:ascii="Arial" w:hAnsi="Arial" w:cs="Arial" w:eastAsia="Arial"/>
           <w:b/>
           <w:color w:val="18354A"/>
-          <w:sz w:val="18"/>
+          <w:sz w:val="20"/>
         </w:rPr>
         <w:t>End-to-End Box-Office Scraping &amp; Content Recommender Pipeline</w:t>
       </w:r>
@@ -890,23 +716,23 @@
     <w:p>
       <w:pPr>
         <w:keepNext/>
-        <w:spacing w:before="0" w:after="12" w:line="240" w:lineRule="auto"/>
+        <w:spacing w:after="30"/>
       </w:pPr>
       <w:r>
         <w:rPr>
           <w:rFonts w:ascii="Arial" w:hAnsi="Arial" w:cs="Arial" w:eastAsia="Arial"/>
           <w:i/>
           <w:color w:val="5E6B75"/>
-          <w:sz w:val="16"/>
+          <w:sz w:val="18"/>
         </w:rPr>
-        <w:t xml:space="preserve">Python 3.10+ · Pandas · BeautifulSoup4 · Streamlit · Data Engineering  |  </w:t>
+        <w:t xml:space="preserve">Python · Pandas · BeautifulSoup4 · Streamlit  |  </w:t>
       </w:r>
       <w:hyperlink r:id="rId19">
         <w:r>
           <w:rPr>
             <w:rFonts w:ascii="Arial" w:hAnsi="Arial" w:cs="Arial" w:eastAsia="Arial"/>
             <w:color w:val="1557A0"/>
-            <w:sz w:val="16"/>
+            <w:sz w:val="18"/>
           </w:rPr>
           <w:t xml:space="preserve">GitHub</w:t>
         </w:r>
@@ -915,80 +741,38 @@
     <w:p>
       <w:pPr>
         <w:keepLines/>
-        <w:spacing w:before="0" w:after="24" w:line="245" w:lineRule="auto"/>
-        <w:ind w:left="259" w:hanging="216"/>
+        <w:spacing w:after="60" w:line="259" w:lineRule="auto"/>
+        <w:ind w:left="274" w:hanging="230"/>
       </w:pPr>
       <w:r>
         <w:rPr>
           <w:rFonts w:ascii="Arial" w:hAnsi="Arial" w:cs="Arial" w:eastAsia="Arial"/>
           <w:b/>
           <w:color w:val="1557A0"/>
-          <w:sz w:val="17"/>
+          <w:sz w:val="20"/>
         </w:rPr>
         <w:t xml:space="preserve">• </w:t>
       </w:r>
       <w:r>
         <w:rPr>
           <w:rFonts w:ascii="Arial" w:hAnsi="Arial" w:cs="Arial" w:eastAsia="Arial"/>
-          <w:b/>
           <w:color w:val="202B35"/>
-          <w:sz w:val="17"/>
+          <w:sz w:val="20"/>
         </w:rPr>
-        <w:t xml:space="preserve">Data pipeline: </w:t>
-      </w:r>
-      <w:r>
-        <w:rPr>
-          <w:rFonts w:ascii="Arial" w:hAnsi="Arial" w:cs="Arial" w:eastAsia="Arial"/>
-          <w:color w:val="202B35"/>
-          <w:sz w:val="17"/>
-        </w:rPr>
-        <w:t>Built a pip-installable src-layout pipeline for 2013–2024 (1392–1403 SH) Iranian box-office archives, producing a cleaned 686-film, 52-column dataset with outlier filtering, Persian numeral normalization, and 43 multi-label genre features (102 unique signatures).</w:t>
-      </w:r>
-    </w:p>
-    <w:p>
-      <w:pPr>
-        <w:keepLines/>
-        <w:spacing w:before="0" w:after="24" w:line="245" w:lineRule="auto"/>
-        <w:ind w:left="259" w:hanging="216"/>
-      </w:pPr>
-      <w:r>
-        <w:rPr>
-          <w:rFonts w:ascii="Arial" w:hAnsi="Arial" w:cs="Arial" w:eastAsia="Arial"/>
-          <w:b/>
-          <w:color w:val="1557A0"/>
-          <w:sz w:val="17"/>
-        </w:rPr>
-        <w:t xml:space="preserve">• </w:t>
-      </w:r>
-      <w:r>
-        <w:rPr>
-          <w:rFonts w:ascii="Arial" w:hAnsi="Arial" w:cs="Arial" w:eastAsia="Arial"/>
-          <w:b/>
-          <w:color w:val="202B35"/>
-          <w:sz w:val="17"/>
-        </w:rPr>
-        <w:t xml:space="preserve">Recommendation &amp; quality: </w:t>
-      </w:r>
-      <w:r>
-        <w:rPr>
-          <w:rFonts w:ascii="Arial" w:hAnsi="Arial" w:cs="Arial" w:eastAsia="Arial"/>
-          <w:color w:val="202B35"/>
-          <w:sz w:val="17"/>
-        </w:rPr>
-        <w:t>Implemented deterministic exact-signature Top-K rankings by critic rating and box-office revenue in a cached Streamlit interface; added 14 pytest tests and Ruff CI across Python 3.10 and 3.12.</w:t>
+        <w:t>Built a Persian box-office pipeline covering 2013–2024 (1392–1403 SH): 686 films, 52 columns, and 43 genre features; added dual Top-K recommendations and 14 automated tests.</w:t>
       </w:r>
     </w:p>
     <w:p>
       <w:pPr>
         <w:keepNext/>
-        <w:spacing w:before="40" w:after="2" w:line="240" w:lineRule="auto"/>
+        <w:spacing w:before="80" w:after="0"/>
       </w:pPr>
       <w:r>
         <w:rPr>
           <w:rFonts w:ascii="Arial" w:hAnsi="Arial" w:cs="Arial" w:eastAsia="Arial"/>
           <w:b/>
           <w:color w:val="18354A"/>
-          <w:sz w:val="18"/>
+          <w:sz w:val="20"/>
         </w:rPr>
         <w:t>Exact-Optimal Fractional Knapsack &amp; DP Benchmark Suite</w:t>
       </w:r>
@@ -996,23 +780,23 @@
     <w:p>
       <w:pPr>
         <w:keepNext/>
-        <w:spacing w:before="0" w:after="12" w:line="240" w:lineRule="auto"/>
+        <w:spacing w:after="30"/>
       </w:pPr>
       <w:r>
         <w:rPr>
           <w:rFonts w:ascii="Arial" w:hAnsi="Arial" w:cs="Arial" w:eastAsia="Arial"/>
           <w:i/>
           <w:color w:val="5E6B75"/>
-          <w:sz w:val="16"/>
+          <w:sz w:val="18"/>
         </w:rPr>
-        <w:t xml:space="preserve">C++17 · Python Benchmarking · Algorithmic Optimization  |  </w:t>
+        <w:t xml:space="preserve">C++17 · Python Benchmarking  |  </w:t>
       </w:r>
       <w:hyperlink r:id="rId20">
         <w:r>
           <w:rPr>
             <w:rFonts w:ascii="Arial" w:hAnsi="Arial" w:cs="Arial" w:eastAsia="Arial"/>
             <w:color w:val="1557A0"/>
-            <w:sz w:val="16"/>
+            <w:sz w:val="18"/>
           </w:rPr>
           <w:t xml:space="preserve">GitHub</w:t>
         </w:r>
@@ -1021,73 +805,31 @@
     <w:p>
       <w:pPr>
         <w:keepLines/>
-        <w:spacing w:before="0" w:after="24" w:line="245" w:lineRule="auto"/>
-        <w:ind w:left="259" w:hanging="216"/>
+        <w:spacing w:after="60" w:line="259" w:lineRule="auto"/>
+        <w:ind w:left="274" w:hanging="230"/>
       </w:pPr>
       <w:r>
         <w:rPr>
           <w:rFonts w:ascii="Arial" w:hAnsi="Arial" w:cs="Arial" w:eastAsia="Arial"/>
           <w:b/>
           <w:color w:val="1557A0"/>
-          <w:sz w:val="17"/>
+          <w:sz w:val="20"/>
         </w:rPr>
         <w:t xml:space="preserve">• </w:t>
       </w:r>
       <w:r>
         <w:rPr>
           <w:rFonts w:ascii="Arial" w:hAnsi="Arial" w:cs="Arial" w:eastAsia="Arial"/>
-          <w:b/>
           <w:color w:val="202B35"/>
-          <w:sz w:val="17"/>
+          <w:sz w:val="20"/>
         </w:rPr>
-        <w:t xml:space="preserve">Algorithms: </w:t>
-      </w:r>
-      <w:r>
-        <w:rPr>
-          <w:rFonts w:ascii="Arial" w:hAnsi="Arial" w:cs="Arial" w:eastAsia="Arial"/>
-          <w:color w:val="202B35"/>
-          <w:sz w:val="17"/>
-        </w:rPr>
-        <w:t>Implemented a header-only O(n log n) C++17 fractional-knapsack solver with a division-free cross-product comparator and deterministic tie-breaking; paired it with an O(nW) rolling-array 0/1 DP reference, an LP-relaxation bound for branch-and-bound, and a formal exchange-argument proof.</w:t>
-      </w:r>
-    </w:p>
-    <w:p>
-      <w:pPr>
-        <w:keepLines/>
-        <w:spacing w:before="0" w:after="24" w:line="245" w:lineRule="auto"/>
-        <w:ind w:left="259" w:hanging="216"/>
-      </w:pPr>
-      <w:r>
-        <w:rPr>
-          <w:rFonts w:ascii="Arial" w:hAnsi="Arial" w:cs="Arial" w:eastAsia="Arial"/>
-          <w:b/>
-          <w:color w:val="1557A0"/>
-          <w:sz w:val="17"/>
-        </w:rPr>
-        <w:t xml:space="preserve">• </w:t>
-      </w:r>
-      <w:r>
-        <w:rPr>
-          <w:rFonts w:ascii="Arial" w:hAnsi="Arial" w:cs="Arial" w:eastAsia="Arial"/>
-          <w:b/>
-          <w:color w:val="202B35"/>
-          <w:sz w:val="17"/>
-        </w:rPr>
-        <w:t xml:space="preserve">Evaluation: </w:t>
-      </w:r>
-      <w:r>
-        <w:rPr>
-          <w:rFonts w:ascii="Arial" w:hAnsi="Arial" w:cs="Arial" w:eastAsia="Arial"/>
-          <w:color w:val="202B35"/>
-          <w:sz w:val="17"/>
-        </w:rPr>
-        <w:t>Validated 328,582 automated checks with zero failures across 20,000 randomized instances. Benchmarked 1.86 ms versus 26.38 s for the O(nW) reference at n=20,000; measured integrality-gap decay from 30.0% (n=5) to 0.05% (n=200).</w:t>
+        <w:t>Developed a header-only O(n log n) solver with a dynamic-programming reference; validated 328,582 checks with zero failures and benchmarked 1.86 ms versus 26.38 s at n=20,000.</w:t>
       </w:r>
     </w:p>
     <w:p>
       <w:pPr>
         <w:keepNext/>
-        <w:spacing w:before="100" w:after="60" w:line="240" w:lineRule="auto"/>
+        <w:spacing w:before="140" w:after="80" w:line="240" w:lineRule="auto"/>
         <w:pBdr>
           <w:bottom w:val="single" w:sz="5" w:space="2" w:color="D6E0E7"/>
         </w:pBdr>
@@ -1097,7 +839,7 @@
           <w:rFonts w:ascii="Arial" w:hAnsi="Arial" w:cs="Arial" w:eastAsia="Arial"/>
           <w:b/>
           <w:color w:val="18354A"/>
-          <w:sz w:val="21"/>
+          <w:sz w:val="23"/>
         </w:rPr>
         <w:t>PROFESSIONAL EXPERIENCE</w:t>
       </w:r>
@@ -1106,16 +848,16 @@
       <w:pPr>
         <w:keepNext/>
         <w:tabs>
-          <w:tab w:pos="10296" w:val="right"/>
+          <w:tab w:pos="10152" w:val="right"/>
         </w:tabs>
-        <w:spacing w:before="50" w:after="8" w:line="240" w:lineRule="auto"/>
+        <w:spacing w:before="80" w:after="10"/>
       </w:pPr>
       <w:r>
         <w:rPr>
           <w:rFonts w:ascii="Arial" w:hAnsi="Arial" w:cs="Arial" w:eastAsia="Arial"/>
           <w:b/>
           <w:color w:val="18354A"/>
-          <w:sz w:val="19"/>
+          <w:sz w:val="20"/>
         </w:rPr>
         <w:t>Computer Engineer &amp; IT Specialist</w:t>
       </w:r>
@@ -1124,7 +866,7 @@
           <w:rFonts w:ascii="Arial" w:hAnsi="Arial" w:cs="Arial" w:eastAsia="Arial"/>
           <w:b/>
           <w:color w:val="5E6B75"/>
-          <w:sz w:val="17"/>
+          <w:sz w:val="18"/>
         </w:rPr>
         <w:tab/>
         <w:t>Mar 2025 – Present (Full-Time)</w:t>
@@ -1133,14 +875,14 @@
     <w:p>
       <w:pPr>
         <w:keepNext/>
-        <w:spacing w:after="10" w:line="240" w:lineRule="auto"/>
+        <w:spacing w:after="20"/>
       </w:pPr>
       <w:r>
         <w:rPr>
           <w:rFonts w:ascii="Arial" w:hAnsi="Arial" w:cs="Arial" w:eastAsia="Arial"/>
           <w:i/>
           <w:color w:val="5E6B75"/>
-          <w:sz w:val="17"/>
+          <w:sz w:val="18"/>
         </w:rPr>
         <w:t>Khakab Sazeh Ghomes Co. | Semnan, Iran</w:t>
       </w:r>
@@ -1148,83 +890,41 @@
     <w:p>
       <w:pPr>
         <w:keepLines/>
-        <w:spacing w:before="0" w:after="22" w:line="245" w:lineRule="auto"/>
-        <w:ind w:left="259" w:hanging="216"/>
+        <w:spacing w:after="60" w:line="259" w:lineRule="auto"/>
+        <w:ind w:left="274" w:hanging="230"/>
       </w:pPr>
       <w:r>
         <w:rPr>
           <w:rFonts w:ascii="Arial" w:hAnsi="Arial" w:cs="Arial" w:eastAsia="Arial"/>
           <w:b/>
           <w:color w:val="1557A0"/>
-          <w:sz w:val="18"/>
+          <w:sz w:val="19"/>
         </w:rPr>
         <w:t xml:space="preserve">• </w:t>
       </w:r>
       <w:r>
         <w:rPr>
           <w:rFonts w:ascii="Arial" w:hAnsi="Arial" w:cs="Arial" w:eastAsia="Arial"/>
-          <w:b/>
           <w:color w:val="202B35"/>
-          <w:sz w:val="18"/>
+          <w:sz w:val="19"/>
         </w:rPr>
-        <w:t xml:space="preserve">IT operations: </w:t>
-      </w:r>
-      <w:r>
-        <w:rPr>
-          <w:rFonts w:ascii="Arial" w:hAnsi="Arial" w:cs="Arial" w:eastAsia="Arial"/>
-          <w:color w:val="202B35"/>
-          <w:sz w:val="18"/>
-        </w:rPr>
-        <w:t>Manage internal networks, computers, user accounts, hardware/software provisioning, installation, troubleshooting, and day-to-day system administration.</w:t>
-      </w:r>
-    </w:p>
-    <w:p>
-      <w:pPr>
-        <w:keepLines/>
-        <w:spacing w:before="0" w:after="22" w:line="245" w:lineRule="auto"/>
-        <w:ind w:left="259" w:hanging="216"/>
-      </w:pPr>
-      <w:r>
-        <w:rPr>
-          <w:rFonts w:ascii="Arial" w:hAnsi="Arial" w:cs="Arial" w:eastAsia="Arial"/>
-          <w:b/>
-          <w:color w:val="1557A0"/>
-          <w:sz w:val="18"/>
-        </w:rPr>
-        <w:t xml:space="preserve">• </w:t>
-      </w:r>
-      <w:r>
-        <w:rPr>
-          <w:rFonts w:ascii="Arial" w:hAnsi="Arial" w:cs="Arial" w:eastAsia="Arial"/>
-          <w:b/>
-          <w:color w:val="202B35"/>
-          <w:sz w:val="18"/>
-        </w:rPr>
-        <w:t xml:space="preserve">Automation &amp; reporting: </w:t>
-      </w:r>
-      <w:r>
-        <w:rPr>
-          <w:rFonts w:ascii="Arial" w:hAnsi="Arial" w:cs="Arial" w:eastAsia="Arial"/>
-          <w:color w:val="202B35"/>
-          <w:sz w:val="18"/>
-        </w:rPr>
-        <w:t>Build relational-database and reporting workflows with Microsoft Access and Excel; automate financial/engineering billing, project scheduling, resource tracking, and recurring office/documentation tasks using Excel, Access, and Microsoft Project.</w:t>
+        <w:t>Maintain company computers, internal networks, hardware/software, and user accounts; handle installation, troubleshooting, and day-to-day IT support. Build Access/Excel reports and automate financial/engineering billing, scheduling, and resource tracking with Microsoft Project.</w:t>
       </w:r>
     </w:p>
     <w:p>
       <w:pPr>
         <w:keepNext/>
         <w:tabs>
-          <w:tab w:pos="10296" w:val="right"/>
+          <w:tab w:pos="10152" w:val="right"/>
         </w:tabs>
-        <w:spacing w:before="50" w:after="8" w:line="240" w:lineRule="auto"/>
+        <w:spacing w:before="80" w:after="10"/>
       </w:pPr>
       <w:r>
         <w:rPr>
           <w:rFonts w:ascii="Arial" w:hAnsi="Arial" w:cs="Arial" w:eastAsia="Arial"/>
           <w:b/>
           <w:color w:val="18354A"/>
-          <w:sz w:val="19"/>
+          <w:sz w:val="20"/>
         </w:rPr>
         <w:t>Game Developer &amp; Software Engineering Intern</w:t>
       </w:r>
@@ -1233,7 +933,7 @@
           <w:rFonts w:ascii="Arial" w:hAnsi="Arial" w:cs="Arial" w:eastAsia="Arial"/>
           <w:b/>
           <w:color w:val="5E6B75"/>
-          <w:sz w:val="17"/>
+          <w:sz w:val="18"/>
         </w:rPr>
         <w:tab/>
         <w:t>Jul 2025 – Dec 2025</w:t>
@@ -1242,14 +942,14 @@
     <w:p>
       <w:pPr>
         <w:keepNext/>
-        <w:spacing w:after="10" w:line="240" w:lineRule="auto"/>
+        <w:spacing w:after="20"/>
       </w:pPr>
       <w:r>
         <w:rPr>
           <w:rFonts w:ascii="Arial" w:hAnsi="Arial" w:cs="Arial" w:eastAsia="Arial"/>
           <w:i/>
           <w:color w:val="5E6B75"/>
-          <w:sz w:val="17"/>
+          <w:sz w:val="18"/>
         </w:rPr>
         <w:t>Sargarmi Sazan Aseman Omid (Game Development Studio) | Iran</w:t>
       </w:r>
@@ -1257,73 +957,49 @@
     <w:p>
       <w:pPr>
         <w:keepLines/>
-        <w:spacing w:before="0" w:after="22" w:line="245" w:lineRule="auto"/>
-        <w:ind w:left="259" w:hanging="216"/>
+        <w:spacing w:after="60" w:line="259" w:lineRule="auto"/>
+        <w:ind w:left="274" w:hanging="230"/>
       </w:pPr>
       <w:r>
         <w:rPr>
           <w:rFonts w:ascii="Arial" w:hAnsi="Arial" w:cs="Arial" w:eastAsia="Arial"/>
           <w:b/>
           <w:color w:val="1557A0"/>
-          <w:sz w:val="18"/>
+          <w:sz w:val="19"/>
         </w:rPr>
         <w:t xml:space="preserve">• </w:t>
       </w:r>
       <w:r>
         <w:rPr>
           <w:rFonts w:ascii="Arial" w:hAnsi="Arial" w:cs="Arial" w:eastAsia="Arial"/>
-          <w:b/>
           <w:color w:val="202B35"/>
-          <w:sz w:val="18"/>
+          <w:sz w:val="19"/>
         </w:rPr>
-        <w:t xml:space="preserve">Gameplay systems: </w:t>
+        <w:t>Built Unity/C# gameplay systems with Entitas ECS and uGUI/TextMeshPro; profiled and optimized builds. Also developed an open-source Unity 6 directory UI with LINQ-powered search and sorting.</w:t>
       </w:r>
       <w:r>
         <w:rPr>
           <w:rFonts w:ascii="Arial" w:hAnsi="Arial" w:cs="Arial" w:eastAsia="Arial"/>
           <w:color w:val="202B35"/>
-          <w:sz w:val="18"/>
+          <w:sz w:val="19"/>
         </w:rPr>
-        <w:t>Developed core Unity/C# gameplay mechanics using the Entitas Entity Component System (ECS), separating component state from reactive execution systems on proprietary studio projects.</w:t>
+        <w:t xml:space="preserve">  </w:t>
       </w:r>
-    </w:p>
-    <w:p>
-      <w:pPr>
-        <w:keepLines/>
-        <w:spacing w:before="0" w:after="22" w:line="245" w:lineRule="auto"/>
-        <w:ind w:left="259" w:hanging="216"/>
-      </w:pPr>
-      <w:r>
-        <w:rPr>
-          <w:rFonts w:ascii="Arial" w:hAnsi="Arial" w:cs="Arial" w:eastAsia="Arial"/>
-          <w:b/>
-          <w:color w:val="1557A0"/>
-          <w:sz w:val="18"/>
-        </w:rPr>
-        <w:t xml:space="preserve">• </w:t>
-      </w:r>
-      <w:r>
-        <w:rPr>
-          <w:rFonts w:ascii="Arial" w:hAnsi="Arial" w:cs="Arial" w:eastAsia="Arial"/>
-          <w:b/>
-          <w:color w:val="202B35"/>
-          <w:sz w:val="18"/>
-        </w:rPr>
-        <w:t xml:space="preserve">UI &amp; engineering: </w:t>
-      </w:r>
-      <w:r>
-        <w:rPr>
-          <w:rFonts w:ascii="Arial" w:hAnsi="Arial" w:cs="Arial" w:eastAsia="Arial"/>
-          <w:color w:val="202B35"/>
-          <w:sz w:val="18"/>
-        </w:rPr>
-        <w:t>Built uGUI and TextMeshPro interfaces, contributed profiling and optimization, and developed an open-source Unity 6 uGUI/URP 2D directory with LINQ-powered search and sorting. Collaborated with Git and Plastic SCM (Unity Version Control).</w:t>
-      </w:r>
+      <w:hyperlink r:id="rId21">
+        <w:r>
+          <w:rPr>
+            <w:rFonts w:ascii="Arial" w:hAnsi="Arial" w:cs="Arial" w:eastAsia="Arial"/>
+            <w:color w:val="1557A0"/>
+            <w:sz w:val="19"/>
+          </w:rPr>
+          <w:t xml:space="preserve">GitHub project</w:t>
+        </w:r>
+      </w:hyperlink>
     </w:p>
     <w:p>
       <w:pPr>
         <w:keepNext/>
-        <w:spacing w:before="100" w:after="60" w:line="240" w:lineRule="auto"/>
+        <w:spacing w:before="140" w:after="80" w:line="240" w:lineRule="auto"/>
         <w:pBdr>
           <w:bottom w:val="single" w:sz="5" w:space="2" w:color="D6E0E7"/>
         </w:pBdr>
@@ -1333,65 +1009,65 @@
           <w:rFonts w:ascii="Arial" w:hAnsi="Arial" w:cs="Arial" w:eastAsia="Arial"/>
           <w:b/>
           <w:color w:val="18354A"/>
-          <w:sz w:val="21"/>
+          <w:sz w:val="23"/>
         </w:rPr>
         <w:t>TECHNICAL SKILLS</w:t>
       </w:r>
     </w:p>
     <w:p>
       <w:pPr>
-        <w:spacing w:after="14" w:line="240" w:lineRule="auto"/>
+        <w:spacing w:after="40" w:line="250" w:lineRule="auto"/>
       </w:pPr>
       <w:r>
         <w:rPr>
           <w:rFonts w:ascii="Arial" w:hAnsi="Arial" w:cs="Arial" w:eastAsia="Arial"/>
           <w:b/>
           <w:color w:val="18354A"/>
-          <w:sz w:val="17"/>
+          <w:sz w:val="19"/>
         </w:rPr>
-        <w:t xml:space="preserve">Programming languages: </w:t>
+        <w:t xml:space="preserve">Programming: </w:t>
       </w:r>
       <w:r>
         <w:rPr>
           <w:rFonts w:ascii="Arial" w:hAnsi="Arial" w:cs="Arial" w:eastAsia="Arial"/>
           <w:color w:val="202B35"/>
-          <w:sz w:val="17"/>
+          <w:sz w:val="19"/>
         </w:rPr>
         <w:t>C++17, C, Python 3, ARMv7-A Assembly, C#, PHP 8, JavaScript, SQL, HTML5/CSS3</w:t>
       </w:r>
     </w:p>
     <w:p>
       <w:pPr>
-        <w:spacing w:after="14" w:line="240" w:lineRule="auto"/>
+        <w:spacing w:after="40" w:line="250" w:lineRule="auto"/>
       </w:pPr>
       <w:r>
         <w:rPr>
           <w:rFonts w:ascii="Arial" w:hAnsi="Arial" w:cs="Arial" w:eastAsia="Arial"/>
           <w:b/>
           <w:color w:val="18354A"/>
-          <w:sz w:val="17"/>
+          <w:sz w:val="19"/>
         </w:rPr>
-        <w:t xml:space="preserve">AI, NLP &amp; data: </w:t>
+        <w:t xml:space="preserve">AI &amp; data: </w:t>
       </w:r>
       <w:r>
         <w:rPr>
           <w:rFonts w:ascii="Arial" w:hAnsi="Arial" w:cs="Arial" w:eastAsia="Arial"/>
           <w:color w:val="202B35"/>
-          <w:sz w:val="17"/>
+          <w:sz w:val="19"/>
         </w:rPr>
-        <w:t>LLM structured extraction, Whisper speech-to-text, Persian NLP normalization, Pandas, BeautifulSoup4, Streamlit, WER/F1 evaluation</w:t>
+        <w:t>LLM extraction, Whisper STT, Persian NLP, Pandas, BeautifulSoup4, Streamlit, WER/F1 evaluation</w:t>
       </w:r>
     </w:p>
     <w:p>
       <w:pPr>
-        <w:spacing w:after="14" w:line="240" w:lineRule="auto"/>
+        <w:spacing w:after="40" w:line="250" w:lineRule="auto"/>
       </w:pPr>
       <w:r>
         <w:rPr>
           <w:rFonts w:ascii="Arial" w:hAnsi="Arial" w:cs="Arial" w:eastAsia="Arial"/>
           <w:b/>
           <w:color w:val="18354A"/>
-          <w:sz w:val="17"/>
+          <w:sz w:val="19"/>
         </w:rPr>
         <w:t xml:space="preserve">Systems &amp; verification: </w:t>
       </w:r>
@@ -1399,59 +1075,37 @@
         <w:rPr>
           <w:rFonts w:ascii="Arial" w:hAnsi="Arial" w:cs="Arial" w:eastAsia="Arial"/>
           <w:color w:val="202B35"/>
-          <w:sz w:val="17"/>
+          <w:sz w:val="19"/>
         </w:rPr>
-        <w:t>IEEE 754 arithmetic, differential FPU testing (fesetround), deterministic rasterization, Unicorn CPU emulation, memory-mapped I/O</w:t>
+        <w:t>IEEE 754, differential FPU testing, deterministic rasterization, Unicorn emulation, memory-mapped I/O</w:t>
       </w:r>
     </w:p>
     <w:p>
       <w:pPr>
-        <w:spacing w:after="14" w:line="240" w:lineRule="auto"/>
+        <w:spacing w:after="40" w:line="250" w:lineRule="auto"/>
       </w:pPr>
       <w:r>
         <w:rPr>
           <w:rFonts w:ascii="Arial" w:hAnsi="Arial" w:cs="Arial" w:eastAsia="Arial"/>
           <w:b/>
           <w:color w:val="18354A"/>
-          <w:sz w:val="17"/>
+          <w:sz w:val="19"/>
         </w:rPr>
-        <w:t xml:space="preserve">Web, databases &amp; security: </w:t>
+        <w:t xml:space="preserve">Web, graphics &amp; tools: </w:t>
       </w:r>
       <w:r>
         <w:rPr>
           <w:rFonts w:ascii="Arial" w:hAnsi="Arial" w:cs="Arial" w:eastAsia="Arial"/>
           <w:color w:val="202B35"/>
-          <w:sz w:val="17"/>
+          <w:sz w:val="19"/>
         </w:rPr>
-        <w:t>REST-style APIs, PWA/SPA, Neshan Leaflet SDK, MySQL/MariaDB/SQLite (PDO, migrations), HMAC-SHA256, HS256 JWT (RFC 7519), rate limiting</w:t>
-      </w:r>
-    </w:p>
-    <w:p>
-      <w:pPr>
-        <w:spacing w:after="14" w:line="240" w:lineRule="auto"/>
-      </w:pPr>
-      <w:r>
-        <w:rPr>
-          <w:rFonts w:ascii="Arial" w:hAnsi="Arial" w:cs="Arial" w:eastAsia="Arial"/>
-          <w:b/>
-          <w:color w:val="18354A"/>
-          <w:sz w:val="17"/>
-        </w:rPr>
-        <w:t xml:space="preserve">Graphics, engines &amp; tools: </w:t>
-      </w:r>
-      <w:r>
-        <w:rPr>
-          <w:rFonts w:ascii="Arial" w:hAnsi="Arial" w:cs="Arial" w:eastAsia="Arial"/>
-          <w:color w:val="202B35"/>
-          <w:sz w:val="17"/>
-        </w:rPr>
-        <w:t>OpenGL/FreeGLUT, Unity 6 (uGUI, URP 2D, LINQ), Entitas ECS, GitHub Actions, CMake, GCC/Clang/MSVC, Docker, Pytest, Ruff, Puppeteer</w:t>
+        <w:t>REST APIs, PWA, Neshan Leaflet, MySQL/MariaDB/SQLite, PDO, HMAC-SHA256/JWT, OpenGL/FreeGLUT, Unity 6/Entitas ECS, Git/Plastic SCM, GitHub Actions, CMake, Docker, Pytest, Ruff, Puppeteer</w:t>
       </w:r>
     </w:p>
     <w:p>
       <w:pPr>
         <w:keepNext/>
-        <w:spacing w:before="100" w:after="60" w:line="240" w:lineRule="auto"/>
+        <w:spacing w:before="120" w:after="80" w:line="240" w:lineRule="auto"/>
         <w:pBdr>
           <w:bottom w:val="single" w:sz="5" w:space="2" w:color="D6E0E7"/>
         </w:pBdr>
@@ -1461,7 +1115,7 @@
           <w:rFonts w:ascii="Arial" w:hAnsi="Arial" w:cs="Arial" w:eastAsia="Arial"/>
           <w:b/>
           <w:color w:val="18354A"/>
-          <w:sz w:val="21"/>
+          <w:sz w:val="23"/>
         </w:rPr>
         <w:t>LANGUAGES</w:t>
       </w:r>
@@ -1475,7 +1129,7 @@
           <w:rFonts w:ascii="Arial" w:hAnsi="Arial" w:cs="Arial" w:eastAsia="Arial"/>
           <w:b/>
           <w:color w:val="18354A"/>
-          <w:sz w:val="17"/>
+          <w:sz w:val="18"/>
         </w:rPr>
         <w:t xml:space="preserve">Persian: </w:t>
       </w:r>
@@ -1483,7 +1137,7 @@
         <w:rPr>
           <w:rFonts w:ascii="Arial" w:hAnsi="Arial" w:cs="Arial" w:eastAsia="Arial"/>
           <w:color w:val="202B35"/>
-          <w:sz w:val="17"/>
+          <w:sz w:val="18"/>
         </w:rPr>
         <w:t xml:space="preserve">Native  |  </w:t>
       </w:r>
@@ -1492,7 +1146,7 @@
           <w:rFonts w:ascii="Arial" w:hAnsi="Arial" w:cs="Arial" w:eastAsia="Arial"/>
           <w:b/>
           <w:color w:val="18354A"/>
-          <w:sz w:val="17"/>
+          <w:sz w:val="18"/>
         </w:rPr>
         <w:t xml:space="preserve">English: </w:t>
       </w:r>
@@ -1500,15 +1154,15 @@
         <w:rPr>
           <w:rFonts w:ascii="Arial" w:hAnsi="Arial" w:cs="Arial" w:eastAsia="Arial"/>
           <w:color w:val="202B35"/>
-          <w:sz w:val="17"/>
+          <w:sz w:val="18"/>
         </w:rPr>
         <w:t>Advanced working proficiency</w:t>
       </w:r>
     </w:p>
     <w:sectPr>
-      <w:footerReference w:type="default" r:id="rId21"/>
+      <w:footerReference w:type="default" r:id="rId22"/>
       <w:pgSz w:w="12240" w:h="15840"/>
-      <w:pgMar w:top="821" w:right="979" w:bottom="792" w:left="979" w:header="360" w:footer="374" w:gutter="0"/>
+      <w:pgMar w:top="893" w:right="1037" w:bottom="835" w:left="1037" w:header="360" w:footer="403" w:gutter="0"/>
       <w:cols w:space="720"/>
       <w:docGrid w:linePitch="360"/>
     </w:sectPr>
@@ -1915,12 +1569,12 @@
     <w:qFormat/>
     <w:rsid w:val="00FC693F"/>
     <w:pPr>
-      <w:spacing w:after="30" w:line="245" w:lineRule="auto"/>
+      <w:spacing w:after="40" w:line="259" w:lineRule="auto"/>
     </w:pPr>
     <w:rPr>
-      <w:rFonts w:ascii="Arial" w:hAnsi="Arial" w:eastAsia="Arial" w:cs="Arial"/>
+      <w:rFonts w:ascii="Arial" w:hAnsi="Arial" w:cs="Arial" w:eastAsia="Arial"/>
       <w:color w:val="202B35"/>
-      <w:sz w:val="18"/>
+      <w:sz w:val="20"/>
     </w:rPr>
   </w:style>
   <w:style w:type="paragraph" w:styleId="Header">

</xml_diff>